<commit_message>
represenative simulation video addded ..and documentation done
</commit_message>
<xml_diff>
--- a/DSA_Queue_Simulator_Report.docx
+++ b/DSA_Queue_Simulator_Report.docx
@@ -717,7 +717,10 @@
           <w:rFonts w:asciiTheme="minorHAnsi" w:hAnsiTheme="minorHAnsi" w:cstheme="minorHAnsi"/>
           <w:color w:val="000000" w:themeColor="text1"/>
         </w:rPr>
-        <w:t> Vehicles are served equally from each lane, ensuring fair dispatch.</w:t>
+        <w:t> </w:t>
+      </w:r>
+      <w:r>
+        <w:t>Vehicles are released equally from each lane, ensuring balanced flow.</w:t>
       </w:r>
     </w:p>
     <w:p>
@@ -756,7 +759,21 @@
           <w:rFonts w:asciiTheme="minorHAnsi" w:hAnsiTheme="minorHAnsi" w:cstheme="minorHAnsi"/>
           <w:color w:val="000000" w:themeColor="text1"/>
         </w:rPr>
-        <w:t> If a priority lane accumulates more than 10 vehicles, it is served first until the count drops below 5, after which normal conditions resume.</w:t>
+        <w:t xml:space="preserve"> If a priority lane accumulates more than 10 vehicles, it is served first until the count drops below </w:t>
+      </w:r>
+      <w:r>
+        <w:rPr>
+          <w:rFonts w:asciiTheme="minorHAnsi" w:hAnsiTheme="minorHAnsi" w:cstheme="minorHAnsi"/>
+          <w:color w:val="000000" w:themeColor="text1"/>
+        </w:rPr>
+        <w:t>5</w:t>
+      </w:r>
+      <w:r>
+        <w:rPr>
+          <w:rFonts w:asciiTheme="minorHAnsi" w:hAnsiTheme="minorHAnsi" w:cstheme="minorHAnsi"/>
+          <w:color w:val="000000" w:themeColor="text1"/>
+        </w:rPr>
+        <w:t>, after which normal conditions resume.</w:t>
       </w:r>
     </w:p>
     <w:p>
@@ -798,7 +815,19 @@
           <w:sz w:val="21"/>
           <w:szCs w:val="21"/>
         </w:rPr>
-        <w:t>i.</w:t>
+        <w:t>I</w:t>
+      </w:r>
+      <w:r>
+        <w:rPr>
+          <w:rStyle w:val="HTMLCode"/>
+          <w:rFonts w:asciiTheme="minorHAnsi" w:hAnsiTheme="minorHAnsi" w:cstheme="minorHAnsi"/>
+          <w:b/>
+          <w:bCs/>
+          <w:color w:val="000000" w:themeColor="text1"/>
+          <w:sz w:val="21"/>
+          <w:szCs w:val="21"/>
+        </w:rPr>
+        <w:t>.</w:t>
       </w:r>
       <w:r>
         <w:rPr>
@@ -862,7 +891,19 @@
           <w:sz w:val="21"/>
           <w:szCs w:val="21"/>
         </w:rPr>
-        <w:t xml:space="preserve">ii. </w:t>
+        <w:t>II</w:t>
+      </w:r>
+      <w:r>
+        <w:rPr>
+          <w:rStyle w:val="HTMLCode"/>
+          <w:rFonts w:asciiTheme="minorHAnsi" w:hAnsiTheme="minorHAnsi" w:cstheme="minorHAnsi"/>
+          <w:b/>
+          <w:bCs/>
+          <w:color w:val="000000" w:themeColor="text1"/>
+          <w:sz w:val="21"/>
+          <w:szCs w:val="21"/>
+        </w:rPr>
+        <w:t xml:space="preserve">. </w:t>
       </w:r>
       <w:r>
         <w:rPr>
@@ -1035,6 +1076,7 @@
                       <w:color w:val="000000" w:themeColor="text1"/>
                     </w:rPr>
                   </w:pPr>
+                  <w:bookmarkStart w:id="1" w:name="_GoBack"/>
                   <w:r>
                     <w:rPr>
                       <w:rStyle w:val="Strong"/>
@@ -1353,6 +1395,7 @@
                   <w:tcBorders>
                     <w:top w:val="single" w:sz="4" w:space="0" w:color="auto"/>
                     <w:left w:val="single" w:sz="4" w:space="0" w:color="auto"/>
+                    <w:bottom w:val="single" w:sz="4" w:space="0" w:color="auto"/>
                     <w:right w:val="single" w:sz="4" w:space="0" w:color="auto"/>
                   </w:tcBorders>
                   <w:vAlign w:val="center"/>
@@ -1395,6 +1438,7 @@
                   <w:tcBorders>
                     <w:top w:val="single" w:sz="4" w:space="0" w:color="auto"/>
                     <w:left w:val="single" w:sz="4" w:space="0" w:color="auto"/>
+                    <w:bottom w:val="single" w:sz="4" w:space="0" w:color="auto"/>
                     <w:right w:val="single" w:sz="4" w:space="0" w:color="auto"/>
                   </w:tcBorders>
                   <w:vAlign w:val="center"/>
@@ -1429,6 +1473,7 @@
           </w:p>
         </w:tc>
       </w:tr>
+      <w:bookmarkEnd w:id="1"/>
     </w:tbl>
     <w:p>
       <w:pPr>
@@ -2238,6 +2283,15 @@
           <w:sz w:val="28"/>
           <w:szCs w:val="28"/>
         </w:rPr>
+        <w:t>5.</w:t>
+      </w:r>
+      <w:r>
+        <w:rPr>
+          <w:b/>
+          <w:color w:val="000000" w:themeColor="text1"/>
+          <w:sz w:val="28"/>
+          <w:szCs w:val="28"/>
+        </w:rPr>
         <w:t>Time Complexity</w:t>
       </w:r>
     </w:p>
@@ -2542,15 +2596,15 @@
         </w:rPr>
         <w:t xml:space="preserve"> </w:t>
       </w:r>
-      <w:bookmarkStart w:id="1" w:name="_GoBack"/>
-      <w:bookmarkEnd w:id="1"/>
-      <w:r>
-        <w:rPr>
-          <w:rFonts w:asciiTheme="minorHAnsi" w:hAnsiTheme="minorHAnsi" w:cstheme="minorHAnsi"/>
-          <w:color w:val="000000" w:themeColor="text1"/>
-        </w:rPr>
-        <w:t>https://github.com/Brook07/Traffic_light_Management_System.git</w:t>
-      </w:r>
+      <w:hyperlink r:id="rId11" w:history="1">
+        <w:r>
+          <w:rPr>
+            <w:rStyle w:val="Hyperlink"/>
+            <w:rFonts w:asciiTheme="minorHAnsi" w:hAnsiTheme="minorHAnsi" w:cstheme="minorHAnsi"/>
+          </w:rPr>
+          <w:t>https://github.com/Brook07/Traffic_light_Management_System.git</w:t>
+        </w:r>
+      </w:hyperlink>
     </w:p>
     <w:p>
       <w:pPr>
@@ -7685,6 +7739,18 @@
       </w:rPr>
     </w:tblStylePr>
   </w:style>
+  <w:style w:type="character" w:styleId="UnresolvedMention">
+    <w:name w:val="Unresolved Mention"/>
+    <w:basedOn w:val="DefaultParagraphFont"/>
+    <w:uiPriority w:val="99"/>
+    <w:semiHidden/>
+    <w:unhideWhenUsed/>
+    <w:rsid w:val="0083367B"/>
+    <w:rPr>
+      <w:color w:val="605E5C"/>
+      <w:shd w:val="clear" w:color="auto" w:fill="E1DFDD"/>
+    </w:rPr>
+  </w:style>
 </w:styles>
 </file>
 
@@ -8029,7 +8095,7 @@
 </file>
 
 <file path=customXml/itemProps1.xml><?xml version="1.0" encoding="utf-8"?>
-<ds:datastoreItem xmlns:ds="http://schemas.openxmlformats.org/officeDocument/2006/customXml" ds:itemID="{71BAA81B-CB7B-4A45-A70D-0F4BC3E78649}">
+<ds:datastoreItem xmlns:ds="http://schemas.openxmlformats.org/officeDocument/2006/customXml" ds:itemID="{6A6D5343-C532-4A8E-AF97-62FA615E2F1A}">
   <ds:schemaRefs>
     <ds:schemaRef ds:uri="http://schemas.openxmlformats.org/officeDocument/2006/bibliography"/>
   </ds:schemaRefs>

</xml_diff>